<commit_message>
Sổ tay 0.6 + 0.7: script sao lưu CSDL hệ cũ + cảnh báo online tụt (chỉ đọc hệ cũ) + bộ cài Task Scheduler
- ops/sao_luu_csdl_cu.py: API backup SQLite từ kết nối mode=ro (WAL: chép thô mất dữ liệu), integrity_check,
  giữ 14 bản + ảnh chụp danh sách máy CSV, nhật ký sao_luu.log.
- ops/canh_bao_online.py: mỗi phút đọc /internal/machines, Telegram khi rớt >= max(5, 10%) (bỏ máy tắt có chủ ý,
  máy canary), báo mất hub 2 lần liên tiếp + báo hồi; baseline online_<ngày>.csv.
- ops/lay_cau_hinh_cu.py: lấy token nội bộ + Telegram từ hệ cũ (chỉ đọc) cho kho bí mật.
- ops/cai_dat_ops.ps1: CaiDat | KiemTra | Go — khoá quyền D:\ITSupportPlatformSecrets, 2 tác vụ SYSTEM,
  chạy thử sao lưu + tin thử Telegram + một lượt cảnh báo.
- qa/test_ops.py: 9 test. Sổ tay 0.6/0.7 thêm mục "Cách nhanh"; TIEN_DO/CLAUDE.md cập nhật.

Co-Authored-By: Claude Opus 5.5 <noreply@anthropic.com>
</commit_message>
<xml_diff>
--- a/docs/plan/SoTay_ThucHien_ITMonitor_SaaS.docx
+++ b/docs/plan/SoTay_ThucHien_ITMonitor_SaaS.docx
@@ -3478,23 +3478,6 @@
     </w:p>
     <w:p>
       <w:pPr>
-        <w:spacing w:after="40"/>
-        <w:ind w:left="425"/>
-      </w:pPr>
-      <w:r>
-        <w:rPr>
-          <w:b/>
-          <w:color w:val="5B6966"/>
-          <w:sz w:val="23"/>
-        </w:rPr>
-        <w:t xml:space="preserve">Mục đích: </w:t>
-      </w:r>
-      <w:r>
-        <w:t>Suốt thời gian chuyển đổi, luôn có bản sao không quá 24 giờ; đồng thời là ảnh chụp danh sách máy để đối chiếu (bài học 10.21). Script chỉ đọc CSDL, không sửa mã hệ cũ.</w:t>
-      </w:r>
-    </w:p>
-    <w:p>
-      <w:pPr>
         <w:keepNext/>
         <w:spacing w:after="40"/>
         <w:ind w:left="425"/>
@@ -3505,6 +3488,133 @@
           <w:color w:val="5B6966"/>
           <w:sz w:val="23"/>
         </w:rPr>
+        <w:t xml:space="preserve">Cách nhanh: </w:t>
+      </w:r>
+    </w:p>
+    <w:p>
+      <w:pPr>
+        <w:ind w:left="850"/>
+      </w:pPr>
+      <w:r>
+        <w:rPr>
+          <w:b/>
+        </w:rPr>
+        <w:t>Đã có script cài tự động (02/10/2026)</w:t>
+      </w:r>
+      <w:r>
+        <w:t xml:space="preserve"> — làm luôn cả 0.6 và 0.7 trong một lần, PowerShell </w:t>
+      </w:r>
+      <w:r>
+        <w:rPr>
+          <w:b/>
+        </w:rPr>
+        <w:t>Run as Administrator</w:t>
+      </w:r>
+      <w:r>
+        <w:t xml:space="preserve">: </w:t>
+      </w:r>
+    </w:p>
+    <w:p>
+      <w:pPr>
+        <w:pStyle w:val="CodeBlock"/>
+        <w:ind w:left="964"/>
+        <w:shd w:val="clear" w:color="auto" w:fill="EEF3F1"/>
+      </w:pPr>
+      <w:r>
+        <w:t>Set-ExecutionPolicy -Scope Process Bypass -Force; &amp; D:\ITSupportPlatform\platform-deployment\ops\cai_dat_ops.ps1 -Lenh CaiDat</w:t>
+      </w:r>
+    </w:p>
+    <w:p>
+      <w:pPr>
+        <w:spacing w:after="40"/>
+      </w:pPr>
+    </w:p>
+    <w:p>
+      <w:pPr>
+        <w:ind w:left="850"/>
+      </w:pPr>
+      <w:r>
+        <w:t xml:space="preserve">Script sao lưu bằng API backup của SQLite từ kết nối </w:t>
+      </w:r>
+      <w:r>
+        <w:rPr>
+          <w:b/>
+        </w:rPr>
+        <w:t>chỉ đọc</w:t>
+      </w:r>
+      <w:r>
+        <w:t xml:space="preserve"> (CSDL hệ cũ chạy WAL — tệp </w:t>
+      </w:r>
+      <w:r>
+        <w:rPr>
+          <w:rFonts w:ascii="Consolas" w:hAnsi="Consolas" w:eastAsia="Consolas" w:cs="Consolas"/>
+          <w:sz w:val="21"/>
+        </w:rPr>
+        <w:t>-wal</w:t>
+      </w:r>
+      <w:r>
+        <w:t xml:space="preserve"> có lúc lớn hơn tệp chính nên chép tệp thô sẽ mất dữ liệu), kiểm </w:t>
+      </w:r>
+      <w:r>
+        <w:rPr>
+          <w:rFonts w:ascii="Consolas" w:hAnsi="Consolas" w:eastAsia="Consolas" w:cs="Consolas"/>
+          <w:sz w:val="21"/>
+        </w:rPr>
+        <w:t>integrity_check</w:t>
+      </w:r>
+      <w:r>
+        <w:t xml:space="preserve">, giữ 14 bản + ảnh chụp danh sách máy </w:t>
+      </w:r>
+      <w:r>
+        <w:rPr>
+          <w:rFonts w:ascii="Consolas" w:hAnsi="Consolas" w:eastAsia="Consolas" w:cs="Consolas"/>
+          <w:sz w:val="21"/>
+        </w:rPr>
+        <w:t>may_&lt;ngày&gt;.csv</w:t>
+      </w:r>
+      <w:r>
+        <w:t xml:space="preserve">. Đo thật: 889 máy, 29 MB, ≈ 1 giây. Mã nguồn + test: </w:t>
+      </w:r>
+      <w:r>
+        <w:rPr>
+          <w:rFonts w:ascii="Consolas" w:hAnsi="Consolas" w:eastAsia="Consolas" w:cs="Consolas"/>
+          <w:sz w:val="21"/>
+        </w:rPr>
+        <w:t>platform-deployment\ops\sao_luu_csdl_cu.py</w:t>
+      </w:r>
+      <w:r>
+        <w:t>. Các thao tác tay bên dưới giữ lại để đối chiếu.</w:t>
+      </w:r>
+    </w:p>
+    <w:p>
+      <w:pPr>
+        <w:spacing w:after="40"/>
+        <w:ind w:left="425"/>
+      </w:pPr>
+      <w:r>
+        <w:rPr>
+          <w:b/>
+          <w:color w:val="5B6966"/>
+          <w:sz w:val="23"/>
+        </w:rPr>
+        <w:t xml:space="preserve">Mục đích: </w:t>
+      </w:r>
+      <w:r>
+        <w:t>Suốt thời gian chuyển đổi, luôn có bản sao không quá 24 giờ; đồng thời là ảnh chụp danh sách máy để đối chiếu (bài học 10.21). Script chỉ đọc CSDL, không sửa mã hệ cũ.</w:t>
+      </w:r>
+    </w:p>
+    <w:p>
+      <w:pPr>
+        <w:keepNext/>
+        <w:spacing w:after="40"/>
+        <w:ind w:left="425"/>
+      </w:pPr>
+      <w:r>
+        <w:rPr>
+          <w:b/>
+          <w:color w:val="5B6966"/>
+          <w:sz w:val="23"/>
+        </w:rPr>
         <w:t xml:space="preserve">Thao tác: </w:t>
       </w:r>
     </w:p>
@@ -3998,6 +4108,72 @@
           <w:sz w:val="21"/>
         </w:rPr>
         <w:t xml:space="preserve">] </w:t>
+      </w:r>
+    </w:p>
+    <w:p>
+      <w:pPr>
+        <w:spacing w:after="40"/>
+        <w:ind w:left="425"/>
+      </w:pPr>
+      <w:r>
+        <w:rPr>
+          <w:b/>
+          <w:color w:val="5B6966"/>
+          <w:sz w:val="23"/>
+        </w:rPr>
+        <w:t xml:space="preserve">Cách nhanh: </w:t>
+      </w:r>
+      <w:r>
+        <w:t>Cùng lệnh với 0.6 (</w:t>
+      </w:r>
+      <w:r>
+        <w:rPr>
+          <w:rFonts w:ascii="Consolas" w:hAnsi="Consolas" w:eastAsia="Consolas" w:cs="Consolas"/>
+          <w:sz w:val="21"/>
+        </w:rPr>
+        <w:t>cai_dat_ops.ps1 -Lenh CaiDat</w:t>
+      </w:r>
+      <w:r>
+        <w:t xml:space="preserve">): tự lấy token nội bộ + Telegram từ hệ cũ (chỉ đọc) vào </w:t>
+      </w:r>
+      <w:r>
+        <w:rPr>
+          <w:rFonts w:ascii="Consolas" w:hAnsi="Consolas" w:eastAsia="Consolas" w:cs="Consolas"/>
+          <w:sz w:val="21"/>
+        </w:rPr>
+        <w:t>D:\ITSupportPlatformSecrets</w:t>
+      </w:r>
+      <w:r>
+        <w:t xml:space="preserve"> (khoá quyền SYSTEM + Administrators), đăng ký tác vụ chạy mỗi phút, gửi tin thử Telegram. Bản Python (</w:t>
+      </w:r>
+      <w:r>
+        <w:rPr>
+          <w:rFonts w:ascii="Consolas" w:hAnsi="Consolas" w:eastAsia="Consolas" w:cs="Consolas"/>
+          <w:sz w:val="21"/>
+        </w:rPr>
+        <w:t>platform-deployment\ops\canh_bao_online.py</w:t>
+      </w:r>
+      <w:r>
+        <w:t xml:space="preserve">, có test) thay cho bản PowerShell bên dưới và thêm: </w:t>
+      </w:r>
+      <w:r>
+        <w:rPr>
+          <w:b/>
+        </w:rPr>
+        <w:t>báo ngay khi không gọi được hub 2 lần liên tiếp</w:t>
+      </w:r>
+      <w:r>
+        <w:t xml:space="preserve">, báo khi hub hồi lại. Kiểm bất cứ lúc nào: </w:t>
+      </w:r>
+      <w:r>
+        <w:rPr>
+          <w:rFonts w:ascii="Consolas" w:hAnsi="Consolas" w:eastAsia="Consolas" w:cs="Consolas"/>
+          <w:sz w:val="21"/>
+        </w:rPr>
+        <w:t>cai_dat_ops.ps1 -Lenh KiemTra</w:t>
+      </w:r>
+      <w:r>
+        <w:t>.</w:t>
       </w:r>
     </w:p>
     <w:p>

</xml_diff>